<commit_message>
Add See Code button to module header, header-actions margin-top, updated report files
</commit_message>
<xml_diff>
--- a/3rdSem/PROJECTS/PYTHON/docx/FinalWeeklyReport/docx/Week1_(print 1,3,4,6 pages)_Student_Grade_Management_System_Report.docx
+++ b/3rdSem/PROJECTS/PYTHON/docx/FinalWeeklyReport/docx/Week1_(print 1,3,4,6 pages)_Student_Grade_Management_System_Report.docx
@@ -195,6 +195,7 @@
                 <w:bCs/>
               </w:rPr>
             </w:pPr>
+            <w:proofErr w:type="spellStart"/>
             <w:r>
               <w:rPr>
                 <w:rFonts w:ascii="Calibri" w:eastAsia="Calibri" w:hAnsi="Calibri" w:cs="Calibri"/>
@@ -203,16 +204,9 @@
                 <w:sz w:val="21"/>
                 <w:szCs w:val="21"/>
               </w:rPr>
-              <w:t>Soumyadwip Das (BWU/BTS/25/169)</w:t>
-            </w:r>
-          </w:p>
-          <w:p>
-            <w:pPr>
-              <w:rPr>
-                <w:b/>
-                <w:bCs/>
-              </w:rPr>
-            </w:pPr>
+              <w:t>Soumyadwip</w:t>
+            </w:r>
+            <w:proofErr w:type="spellEnd"/>
             <w:r>
               <w:rPr>
                 <w:rFonts w:ascii="Calibri" w:eastAsia="Calibri" w:hAnsi="Calibri" w:cs="Calibri"/>
@@ -221,11 +215,17 @@
                 <w:sz w:val="21"/>
                 <w:szCs w:val="21"/>
               </w:rPr>
-              <w:t>Ankita Paul (BWU/BTS/25/180)</w:t>
+              <w:t xml:space="preserve"> Das (BWU/BTS/25/169)</w:t>
             </w:r>
           </w:p>
           <w:p>
             <w:pPr>
+              <w:rPr>
+                <w:b/>
+                <w:bCs/>
+              </w:rPr>
+            </w:pPr>
+            <w:r>
               <w:rPr>
                 <w:rFonts w:ascii="Calibri" w:eastAsia="Calibri" w:hAnsi="Calibri" w:cs="Calibri"/>
                 <w:b/>
@@ -233,8 +233,11 @@
                 <w:sz w:val="21"/>
                 <w:szCs w:val="21"/>
               </w:rPr>
-            </w:pPr>
-            <w:r>
+              <w:t>Ankita Paul (BWU/BTS/25/180)</w:t>
+            </w:r>
+          </w:p>
+          <w:p>
+            <w:pPr>
               <w:rPr>
                 <w:rFonts w:ascii="Calibri" w:eastAsia="Calibri" w:hAnsi="Calibri" w:cs="Calibri"/>
                 <w:b/>
@@ -242,11 +245,8 @@
                 <w:sz w:val="21"/>
                 <w:szCs w:val="21"/>
               </w:rPr>
-              <w:t>Sonia Naskar (BWU/BTS/25/195)</w:t>
-            </w:r>
-          </w:p>
-          <w:p>
-            <w:pPr>
+            </w:pPr>
+            <w:r>
               <w:rPr>
                 <w:rFonts w:ascii="Calibri" w:eastAsia="Calibri" w:hAnsi="Calibri" w:cs="Calibri"/>
                 <w:b/>
@@ -254,8 +254,11 @@
                 <w:sz w:val="21"/>
                 <w:szCs w:val="21"/>
               </w:rPr>
-            </w:pPr>
-            <w:r>
+              <w:t>Sonia Naskar (BWU/BTS/25/195)</w:t>
+            </w:r>
+          </w:p>
+          <w:p>
+            <w:pPr>
               <w:rPr>
                 <w:rFonts w:ascii="Calibri" w:eastAsia="Calibri" w:hAnsi="Calibri" w:cs="Calibri"/>
                 <w:b/>
@@ -263,7 +266,28 @@
                 <w:sz w:val="21"/>
                 <w:szCs w:val="21"/>
               </w:rPr>
-              <w:t>Joyeta Mondal (BWU/BTS/25/214)</w:t>
+            </w:pPr>
+            <w:proofErr w:type="spellStart"/>
+            <w:r>
+              <w:rPr>
+                <w:rFonts w:ascii="Calibri" w:eastAsia="Calibri" w:hAnsi="Calibri" w:cs="Calibri"/>
+                <w:b/>
+                <w:bCs/>
+                <w:sz w:val="21"/>
+                <w:szCs w:val="21"/>
+              </w:rPr>
+              <w:t>Joyeta</w:t>
+            </w:r>
+            <w:proofErr w:type="spellEnd"/>
+            <w:r>
+              <w:rPr>
+                <w:rFonts w:ascii="Calibri" w:eastAsia="Calibri" w:hAnsi="Calibri" w:cs="Calibri"/>
+                <w:b/>
+                <w:bCs/>
+                <w:sz w:val="21"/>
+                <w:szCs w:val="21"/>
+              </w:rPr>
+              <w:t xml:space="preserve"> Mondal (BWU/BTS/25/214)</w:t>
             </w:r>
           </w:p>
           <w:p>
@@ -330,6 +354,8 @@
                 <w:bCs/>
               </w:rPr>
             </w:pPr>
+            <w:proofErr w:type="spellStart"/>
+            <w:proofErr w:type="gramStart"/>
             <w:r>
               <w:rPr>
                 <w:rFonts w:ascii="Calibri" w:eastAsia="Calibri" w:hAnsi="Calibri" w:cs="Calibri"/>
@@ -338,7 +364,19 @@
                 <w:sz w:val="21"/>
                 <w:szCs w:val="21"/>
               </w:rPr>
-              <w:t xml:space="preserve">B.Tech CSE &amp; </w:t>
+              <w:t>B.Tech</w:t>
+            </w:r>
+            <w:proofErr w:type="spellEnd"/>
+            <w:proofErr w:type="gramEnd"/>
+            <w:r>
+              <w:rPr>
+                <w:rFonts w:ascii="Calibri" w:eastAsia="Calibri" w:hAnsi="Calibri" w:cs="Calibri"/>
+                <w:b/>
+                <w:bCs/>
+                <w:sz w:val="21"/>
+                <w:szCs w:val="21"/>
+              </w:rPr>
+              <w:t xml:space="preserve"> CSE &amp; </w:t>
             </w:r>
             <w:r>
               <w:rPr>
@@ -510,6 +548,75 @@
           </w:p>
         </w:tc>
       </w:tr>
+      <w:tr>
+        <w:tc>
+          <w:tcPr>
+            <w:tcW w:w="2800" w:type="dxa"/>
+            <w:shd w:val="clear" w:color="auto" w:fill="DCE6F4"/>
+            <w:tcMar>
+              <w:top w:w="100" w:type="dxa"/>
+              <w:left w:w="120" w:type="dxa"/>
+              <w:bottom w:w="100" w:type="dxa"/>
+              <w:right w:w="120" w:type="dxa"/>
+            </w:tcMar>
+            <w:vAlign w:val="center"/>
+          </w:tcPr>
+          <w:p>
+            <w:pPr>
+              <w:rPr>
+                <w:rFonts w:ascii="Calibri" w:eastAsia="Calibri" w:hAnsi="Calibri" w:cs="Calibri"/>
+                <w:b/>
+                <w:bCs/>
+                <w:sz w:val="21"/>
+                <w:szCs w:val="21"/>
+              </w:rPr>
+            </w:pPr>
+            <w:r>
+              <w:rPr>
+                <w:rFonts w:ascii="Calibri" w:eastAsia="Calibri" w:hAnsi="Calibri" w:cs="Calibri"/>
+                <w:b/>
+                <w:bCs/>
+                <w:sz w:val="21"/>
+                <w:szCs w:val="21"/>
+              </w:rPr>
+              <w:t>Project Date</w:t>
+            </w:r>
+          </w:p>
+        </w:tc>
+        <w:tc>
+          <w:tcPr>
+            <w:tcW w:w="6500" w:type="dxa"/>
+            <w:tcMar>
+              <w:top w:w="100" w:type="dxa"/>
+              <w:left w:w="120" w:type="dxa"/>
+              <w:bottom w:w="100" w:type="dxa"/>
+              <w:right w:w="120" w:type="dxa"/>
+            </w:tcMar>
+            <w:vAlign w:val="center"/>
+          </w:tcPr>
+          <w:p>
+            <w:pPr>
+              <w:rPr>
+                <w:rFonts w:ascii="Calibri" w:eastAsia="Calibri" w:hAnsi="Calibri" w:cs="Calibri"/>
+                <w:b/>
+                <w:bCs/>
+                <w:sz w:val="21"/>
+                <w:szCs w:val="21"/>
+              </w:rPr>
+            </w:pPr>
+            <w:r>
+              <w:rPr>
+                <w:rFonts w:ascii="Calibri" w:eastAsia="Calibri" w:hAnsi="Calibri" w:cs="Calibri"/>
+                <w:b/>
+                <w:bCs/>
+                <w:sz w:val="21"/>
+                <w:szCs w:val="21"/>
+              </w:rPr>
+              <w:t>10/07/2026</w:t>
+            </w:r>
+          </w:p>
+        </w:tc>
+      </w:tr>
     </w:tbl>
     <w:p>
       <w:pPr>
@@ -708,7 +815,6 @@
           <w:sz w:val="26"/>
           <w:szCs w:val="26"/>
         </w:rPr>
-        <w:lastRenderedPageBreak/>
         <w:t>2. Introduction and Background</w:t>
       </w:r>
     </w:p>
@@ -1019,7 +1125,79 @@
           <w:sz w:val="22"/>
           <w:szCs w:val="22"/>
         </w:rPr>
-        <w:t>Implemented calculate_grade() to assign letter grades and get_report() to calculate total marks, percentage, and grade</w:t>
+        <w:t xml:space="preserve">Implemented </w:t>
+      </w:r>
+      <w:proofErr w:type="spellStart"/>
+      <w:r>
+        <w:rPr>
+          <w:rFonts w:ascii="Calibri" w:eastAsia="Calibri" w:hAnsi="Calibri" w:cs="Calibri"/>
+          <w:sz w:val="22"/>
+          <w:szCs w:val="22"/>
+        </w:rPr>
+        <w:t>calculate_</w:t>
+      </w:r>
+      <w:proofErr w:type="gramStart"/>
+      <w:r>
+        <w:rPr>
+          <w:rFonts w:ascii="Calibri" w:eastAsia="Calibri" w:hAnsi="Calibri" w:cs="Calibri"/>
+          <w:sz w:val="22"/>
+          <w:szCs w:val="22"/>
+        </w:rPr>
+        <w:t>grade</w:t>
+      </w:r>
+      <w:proofErr w:type="spellEnd"/>
+      <w:r>
+        <w:rPr>
+          <w:rFonts w:ascii="Calibri" w:eastAsia="Calibri" w:hAnsi="Calibri" w:cs="Calibri"/>
+          <w:sz w:val="22"/>
+          <w:szCs w:val="22"/>
+        </w:rPr>
+        <w:t>(</w:t>
+      </w:r>
+      <w:proofErr w:type="gramEnd"/>
+      <w:r>
+        <w:rPr>
+          <w:rFonts w:ascii="Calibri" w:eastAsia="Calibri" w:hAnsi="Calibri" w:cs="Calibri"/>
+          <w:sz w:val="22"/>
+          <w:szCs w:val="22"/>
+        </w:rPr>
+        <w:t xml:space="preserve">) to assign letter grades and </w:t>
+      </w:r>
+      <w:proofErr w:type="spellStart"/>
+      <w:r>
+        <w:rPr>
+          <w:rFonts w:ascii="Calibri" w:eastAsia="Calibri" w:hAnsi="Calibri" w:cs="Calibri"/>
+          <w:sz w:val="22"/>
+          <w:szCs w:val="22"/>
+        </w:rPr>
+        <w:t>get_</w:t>
+      </w:r>
+      <w:proofErr w:type="gramStart"/>
+      <w:r>
+        <w:rPr>
+          <w:rFonts w:ascii="Calibri" w:eastAsia="Calibri" w:hAnsi="Calibri" w:cs="Calibri"/>
+          <w:sz w:val="22"/>
+          <w:szCs w:val="22"/>
+        </w:rPr>
+        <w:t>report</w:t>
+      </w:r>
+      <w:proofErr w:type="spellEnd"/>
+      <w:r>
+        <w:rPr>
+          <w:rFonts w:ascii="Calibri" w:eastAsia="Calibri" w:hAnsi="Calibri" w:cs="Calibri"/>
+          <w:sz w:val="22"/>
+          <w:szCs w:val="22"/>
+        </w:rPr>
+        <w:t>(</w:t>
+      </w:r>
+      <w:proofErr w:type="gramEnd"/>
+      <w:r>
+        <w:rPr>
+          <w:rFonts w:ascii="Calibri" w:eastAsia="Calibri" w:hAnsi="Calibri" w:cs="Calibri"/>
+          <w:sz w:val="22"/>
+          <w:szCs w:val="22"/>
+        </w:rPr>
+        <w:t>) to calculate total marks, percentage, and grade</w:t>
       </w:r>
       <w:r>
         <w:rPr>
@@ -1115,7 +1293,43 @@
           <w:sz w:val="22"/>
           <w:szCs w:val="22"/>
         </w:rPr>
-        <w:t>A functioning calculate_grade() module producing consistent letter grades from percentage scores</w:t>
+        <w:t xml:space="preserve">A functioning </w:t>
+      </w:r>
+      <w:proofErr w:type="spellStart"/>
+      <w:r>
+        <w:rPr>
+          <w:rFonts w:ascii="Calibri" w:eastAsia="Calibri" w:hAnsi="Calibri" w:cs="Calibri"/>
+          <w:sz w:val="22"/>
+          <w:szCs w:val="22"/>
+        </w:rPr>
+        <w:t>calculate_</w:t>
+      </w:r>
+      <w:proofErr w:type="gramStart"/>
+      <w:r>
+        <w:rPr>
+          <w:rFonts w:ascii="Calibri" w:eastAsia="Calibri" w:hAnsi="Calibri" w:cs="Calibri"/>
+          <w:sz w:val="22"/>
+          <w:szCs w:val="22"/>
+        </w:rPr>
+        <w:t>grade</w:t>
+      </w:r>
+      <w:proofErr w:type="spellEnd"/>
+      <w:r>
+        <w:rPr>
+          <w:rFonts w:ascii="Calibri" w:eastAsia="Calibri" w:hAnsi="Calibri" w:cs="Calibri"/>
+          <w:sz w:val="22"/>
+          <w:szCs w:val="22"/>
+        </w:rPr>
+        <w:t>(</w:t>
+      </w:r>
+      <w:proofErr w:type="gramEnd"/>
+      <w:r>
+        <w:rPr>
+          <w:rFonts w:ascii="Calibri" w:eastAsia="Calibri" w:hAnsi="Calibri" w:cs="Calibri"/>
+          <w:sz w:val="22"/>
+          <w:szCs w:val="22"/>
+        </w:rPr>
+        <w:t>) module producing consistent letter grades from percentage scores</w:t>
       </w:r>
     </w:p>
     <w:p>
@@ -1220,7 +1434,6 @@
           <w:sz w:val="26"/>
           <w:szCs w:val="26"/>
         </w:rPr>
-        <w:lastRenderedPageBreak/>
         <w:t>7. Core Logic</w:t>
       </w:r>
     </w:p>
@@ -1267,7 +1480,27 @@
                 <w:sz w:val="18"/>
                 <w:szCs w:val="18"/>
               </w:rPr>
-              <w:t>def calculate_grade(percentage):</w:t>
+              <w:t xml:space="preserve">def </w:t>
+            </w:r>
+            <w:proofErr w:type="spellStart"/>
+            <w:r>
+              <w:rPr>
+                <w:rFonts w:ascii="Consolas" w:eastAsia="Consolas" w:hAnsi="Consolas" w:cs="Consolas"/>
+                <w:color w:val="1F1F1F"/>
+                <w:sz w:val="18"/>
+                <w:szCs w:val="18"/>
+              </w:rPr>
+              <w:t>calculate_grade</w:t>
+            </w:r>
+            <w:proofErr w:type="spellEnd"/>
+            <w:r>
+              <w:rPr>
+                <w:rFonts w:ascii="Consolas" w:eastAsia="Consolas" w:hAnsi="Consolas" w:cs="Consolas"/>
+                <w:color w:val="1F1F1F"/>
+                <w:sz w:val="18"/>
+                <w:szCs w:val="18"/>
+              </w:rPr>
+              <w:t>(percentage):</w:t>
             </w:r>
           </w:p>
           <w:p>
@@ -1300,7 +1533,27 @@
                 <w:sz w:val="18"/>
                 <w:szCs w:val="18"/>
               </w:rPr>
-              <w:t xml:space="preserve">    elif percentage &gt;= 80:</w:t>
+              <w:t xml:space="preserve">    </w:t>
+            </w:r>
+            <w:proofErr w:type="spellStart"/>
+            <w:r>
+              <w:rPr>
+                <w:rFonts w:ascii="Consolas" w:eastAsia="Consolas" w:hAnsi="Consolas" w:cs="Consolas"/>
+                <w:color w:val="1F1F1F"/>
+                <w:sz w:val="18"/>
+                <w:szCs w:val="18"/>
+              </w:rPr>
+              <w:t>elif</w:t>
+            </w:r>
+            <w:proofErr w:type="spellEnd"/>
+            <w:r>
+              <w:rPr>
+                <w:rFonts w:ascii="Consolas" w:eastAsia="Consolas" w:hAnsi="Consolas" w:cs="Consolas"/>
+                <w:color w:val="1F1F1F"/>
+                <w:sz w:val="18"/>
+                <w:szCs w:val="18"/>
+              </w:rPr>
+              <w:t xml:space="preserve"> percentage &gt;= 80:</w:t>
             </w:r>
           </w:p>
           <w:p>
@@ -1322,7 +1575,27 @@
                 <w:sz w:val="18"/>
                 <w:szCs w:val="18"/>
               </w:rPr>
-              <w:t xml:space="preserve">    elif percentage &gt;= 70:</w:t>
+              <w:t xml:space="preserve">    </w:t>
+            </w:r>
+            <w:proofErr w:type="spellStart"/>
+            <w:r>
+              <w:rPr>
+                <w:rFonts w:ascii="Consolas" w:eastAsia="Consolas" w:hAnsi="Consolas" w:cs="Consolas"/>
+                <w:color w:val="1F1F1F"/>
+                <w:sz w:val="18"/>
+                <w:szCs w:val="18"/>
+              </w:rPr>
+              <w:t>elif</w:t>
+            </w:r>
+            <w:proofErr w:type="spellEnd"/>
+            <w:r>
+              <w:rPr>
+                <w:rFonts w:ascii="Consolas" w:eastAsia="Consolas" w:hAnsi="Consolas" w:cs="Consolas"/>
+                <w:color w:val="1F1F1F"/>
+                <w:sz w:val="18"/>
+                <w:szCs w:val="18"/>
+              </w:rPr>
+              <w:t xml:space="preserve"> percentage &gt;= 70:</w:t>
             </w:r>
           </w:p>
           <w:p>
@@ -1344,7 +1617,27 @@
                 <w:sz w:val="18"/>
                 <w:szCs w:val="18"/>
               </w:rPr>
-              <w:t xml:space="preserve">    elif percentage &gt;= 60:</w:t>
+              <w:t xml:space="preserve">    </w:t>
+            </w:r>
+            <w:proofErr w:type="spellStart"/>
+            <w:r>
+              <w:rPr>
+                <w:rFonts w:ascii="Consolas" w:eastAsia="Consolas" w:hAnsi="Consolas" w:cs="Consolas"/>
+                <w:color w:val="1F1F1F"/>
+                <w:sz w:val="18"/>
+                <w:szCs w:val="18"/>
+              </w:rPr>
+              <w:t>elif</w:t>
+            </w:r>
+            <w:proofErr w:type="spellEnd"/>
+            <w:r>
+              <w:rPr>
+                <w:rFonts w:ascii="Consolas" w:eastAsia="Consolas" w:hAnsi="Consolas" w:cs="Consolas"/>
+                <w:color w:val="1F1F1F"/>
+                <w:sz w:val="18"/>
+                <w:szCs w:val="18"/>
+              </w:rPr>
+              <w:t xml:space="preserve"> percentage &gt;= 60:</w:t>
             </w:r>
           </w:p>
           <w:p>
@@ -1366,7 +1659,27 @@
                 <w:sz w:val="18"/>
                 <w:szCs w:val="18"/>
               </w:rPr>
-              <w:t xml:space="preserve">    elif percentage &gt;= 50:</w:t>
+              <w:t xml:space="preserve">    </w:t>
+            </w:r>
+            <w:proofErr w:type="spellStart"/>
+            <w:r>
+              <w:rPr>
+                <w:rFonts w:ascii="Consolas" w:eastAsia="Consolas" w:hAnsi="Consolas" w:cs="Consolas"/>
+                <w:color w:val="1F1F1F"/>
+                <w:sz w:val="18"/>
+                <w:szCs w:val="18"/>
+              </w:rPr>
+              <w:t>elif</w:t>
+            </w:r>
+            <w:proofErr w:type="spellEnd"/>
+            <w:r>
+              <w:rPr>
+                <w:rFonts w:ascii="Consolas" w:eastAsia="Consolas" w:hAnsi="Consolas" w:cs="Consolas"/>
+                <w:color w:val="1F1F1F"/>
+                <w:sz w:val="18"/>
+                <w:szCs w:val="18"/>
+              </w:rPr>
+              <w:t xml:space="preserve"> percentage &gt;= 50:</w:t>
             </w:r>
           </w:p>
           <w:p>
@@ -1388,7 +1701,27 @@
                 <w:sz w:val="18"/>
                 <w:szCs w:val="18"/>
               </w:rPr>
-              <w:t xml:space="preserve">    elif percentage &gt;= 40:</w:t>
+              <w:t xml:space="preserve">    </w:t>
+            </w:r>
+            <w:proofErr w:type="spellStart"/>
+            <w:r>
+              <w:rPr>
+                <w:rFonts w:ascii="Consolas" w:eastAsia="Consolas" w:hAnsi="Consolas" w:cs="Consolas"/>
+                <w:color w:val="1F1F1F"/>
+                <w:sz w:val="18"/>
+                <w:szCs w:val="18"/>
+              </w:rPr>
+              <w:t>elif</w:t>
+            </w:r>
+            <w:proofErr w:type="spellEnd"/>
+            <w:r>
+              <w:rPr>
+                <w:rFonts w:ascii="Consolas" w:eastAsia="Consolas" w:hAnsi="Consolas" w:cs="Consolas"/>
+                <w:color w:val="1F1F1F"/>
+                <w:sz w:val="18"/>
+                <w:szCs w:val="18"/>
+              </w:rPr>
+              <w:t xml:space="preserve"> percentage &gt;= 40:</w:t>
             </w:r>
           </w:p>
           <w:p>
@@ -1443,62 +1776,213 @@
                 <w:sz w:val="18"/>
                 <w:szCs w:val="18"/>
               </w:rPr>
-              <w:t>def get_report(roll):</w:t>
-            </w:r>
-          </w:p>
-          <w:p>
-            <w:r>
-              <w:rPr>
-                <w:rFonts w:ascii="Consolas" w:eastAsia="Consolas" w:hAnsi="Consolas" w:cs="Consolas"/>
-                <w:color w:val="1F1F1F"/>
-                <w:sz w:val="18"/>
-                <w:szCs w:val="18"/>
-              </w:rPr>
-              <w:t xml:space="preserve">    student = STUDENTS[roll]</w:t>
-            </w:r>
-          </w:p>
-          <w:p>
-            <w:r>
-              <w:rPr>
-                <w:rFonts w:ascii="Consolas" w:eastAsia="Consolas" w:hAnsi="Consolas" w:cs="Consolas"/>
-                <w:color w:val="1F1F1F"/>
-                <w:sz w:val="18"/>
-                <w:szCs w:val="18"/>
-              </w:rPr>
-              <w:t xml:space="preserve">    total = sum(student["marks"].values())</w:t>
-            </w:r>
-          </w:p>
-          <w:p>
-            <w:r>
-              <w:rPr>
-                <w:rFonts w:ascii="Consolas" w:eastAsia="Consolas" w:hAnsi="Consolas" w:cs="Consolas"/>
-                <w:color w:val="1F1F1F"/>
-                <w:sz w:val="18"/>
-                <w:szCs w:val="18"/>
-              </w:rPr>
-              <w:t xml:space="preserve">    max_total = 100 * len(SUBJECTS)</w:t>
-            </w:r>
-          </w:p>
-          <w:p>
-            <w:r>
-              <w:rPr>
-                <w:rFonts w:ascii="Consolas" w:eastAsia="Consolas" w:hAnsi="Consolas" w:cs="Consolas"/>
-                <w:color w:val="1F1F1F"/>
-                <w:sz w:val="18"/>
-                <w:szCs w:val="18"/>
-              </w:rPr>
-              <w:t xml:space="preserve">    percentage = (total / max_total) * 100</w:t>
-            </w:r>
-          </w:p>
-          <w:p>
-            <w:r>
-              <w:rPr>
-                <w:rFonts w:ascii="Consolas" w:eastAsia="Consolas" w:hAnsi="Consolas" w:cs="Consolas"/>
-                <w:color w:val="1F1F1F"/>
-                <w:sz w:val="18"/>
-                <w:szCs w:val="18"/>
-              </w:rPr>
-              <w:t xml:space="preserve">    grade = calculate_grade(percentage)</w:t>
+              <w:t xml:space="preserve">def </w:t>
+            </w:r>
+            <w:proofErr w:type="spellStart"/>
+            <w:r>
+              <w:rPr>
+                <w:rFonts w:ascii="Consolas" w:eastAsia="Consolas" w:hAnsi="Consolas" w:cs="Consolas"/>
+                <w:color w:val="1F1F1F"/>
+                <w:sz w:val="18"/>
+                <w:szCs w:val="18"/>
+              </w:rPr>
+              <w:t>get_report</w:t>
+            </w:r>
+            <w:proofErr w:type="spellEnd"/>
+            <w:r>
+              <w:rPr>
+                <w:rFonts w:ascii="Consolas" w:eastAsia="Consolas" w:hAnsi="Consolas" w:cs="Consolas"/>
+                <w:color w:val="1F1F1F"/>
+                <w:sz w:val="18"/>
+                <w:szCs w:val="18"/>
+              </w:rPr>
+              <w:t>(roll):</w:t>
+            </w:r>
+          </w:p>
+          <w:p>
+            <w:r>
+              <w:rPr>
+                <w:rFonts w:ascii="Consolas" w:eastAsia="Consolas" w:hAnsi="Consolas" w:cs="Consolas"/>
+                <w:color w:val="1F1F1F"/>
+                <w:sz w:val="18"/>
+                <w:szCs w:val="18"/>
+              </w:rPr>
+              <w:t xml:space="preserve">    student = </w:t>
+            </w:r>
+            <w:proofErr w:type="gramStart"/>
+            <w:r>
+              <w:rPr>
+                <w:rFonts w:ascii="Consolas" w:eastAsia="Consolas" w:hAnsi="Consolas" w:cs="Consolas"/>
+                <w:color w:val="1F1F1F"/>
+                <w:sz w:val="18"/>
+                <w:szCs w:val="18"/>
+              </w:rPr>
+              <w:t>STUDENTS[</w:t>
+            </w:r>
+            <w:proofErr w:type="gramEnd"/>
+            <w:r>
+              <w:rPr>
+                <w:rFonts w:ascii="Consolas" w:eastAsia="Consolas" w:hAnsi="Consolas" w:cs="Consolas"/>
+                <w:color w:val="1F1F1F"/>
+                <w:sz w:val="18"/>
+                <w:szCs w:val="18"/>
+              </w:rPr>
+              <w:t>roll]</w:t>
+            </w:r>
+          </w:p>
+          <w:p>
+            <w:r>
+              <w:rPr>
+                <w:rFonts w:ascii="Consolas" w:eastAsia="Consolas" w:hAnsi="Consolas" w:cs="Consolas"/>
+                <w:color w:val="1F1F1F"/>
+                <w:sz w:val="18"/>
+                <w:szCs w:val="18"/>
+              </w:rPr>
+              <w:t xml:space="preserve">    total = sum(student["marks"</w:t>
+            </w:r>
+            <w:proofErr w:type="gramStart"/>
+            <w:r>
+              <w:rPr>
+                <w:rFonts w:ascii="Consolas" w:eastAsia="Consolas" w:hAnsi="Consolas" w:cs="Consolas"/>
+                <w:color w:val="1F1F1F"/>
+                <w:sz w:val="18"/>
+                <w:szCs w:val="18"/>
+              </w:rPr>
+              <w:t>].values</w:t>
+            </w:r>
+            <w:proofErr w:type="gramEnd"/>
+            <w:r>
+              <w:rPr>
+                <w:rFonts w:ascii="Consolas" w:eastAsia="Consolas" w:hAnsi="Consolas" w:cs="Consolas"/>
+                <w:color w:val="1F1F1F"/>
+                <w:sz w:val="18"/>
+                <w:szCs w:val="18"/>
+              </w:rPr>
+              <w:t>())</w:t>
+            </w:r>
+          </w:p>
+          <w:p>
+            <w:r>
+              <w:rPr>
+                <w:rFonts w:ascii="Consolas" w:eastAsia="Consolas" w:hAnsi="Consolas" w:cs="Consolas"/>
+                <w:color w:val="1F1F1F"/>
+                <w:sz w:val="18"/>
+                <w:szCs w:val="18"/>
+              </w:rPr>
+              <w:t xml:space="preserve">    </w:t>
+            </w:r>
+            <w:proofErr w:type="spellStart"/>
+            <w:r>
+              <w:rPr>
+                <w:rFonts w:ascii="Consolas" w:eastAsia="Consolas" w:hAnsi="Consolas" w:cs="Consolas"/>
+                <w:color w:val="1F1F1F"/>
+                <w:sz w:val="18"/>
+                <w:szCs w:val="18"/>
+              </w:rPr>
+              <w:t>max_total</w:t>
+            </w:r>
+            <w:proofErr w:type="spellEnd"/>
+            <w:r>
+              <w:rPr>
+                <w:rFonts w:ascii="Consolas" w:eastAsia="Consolas" w:hAnsi="Consolas" w:cs="Consolas"/>
+                <w:color w:val="1F1F1F"/>
+                <w:sz w:val="18"/>
+                <w:szCs w:val="18"/>
+              </w:rPr>
+              <w:t xml:space="preserve"> = 100 * </w:t>
+            </w:r>
+            <w:proofErr w:type="spellStart"/>
+            <w:proofErr w:type="gramStart"/>
+            <w:r>
+              <w:rPr>
+                <w:rFonts w:ascii="Consolas" w:eastAsia="Consolas" w:hAnsi="Consolas" w:cs="Consolas"/>
+                <w:color w:val="1F1F1F"/>
+                <w:sz w:val="18"/>
+                <w:szCs w:val="18"/>
+              </w:rPr>
+              <w:t>len</w:t>
+            </w:r>
+            <w:proofErr w:type="spellEnd"/>
+            <w:r>
+              <w:rPr>
+                <w:rFonts w:ascii="Consolas" w:eastAsia="Consolas" w:hAnsi="Consolas" w:cs="Consolas"/>
+                <w:color w:val="1F1F1F"/>
+                <w:sz w:val="18"/>
+                <w:szCs w:val="18"/>
+              </w:rPr>
+              <w:t>(</w:t>
+            </w:r>
+            <w:proofErr w:type="gramEnd"/>
+            <w:r>
+              <w:rPr>
+                <w:rFonts w:ascii="Consolas" w:eastAsia="Consolas" w:hAnsi="Consolas" w:cs="Consolas"/>
+                <w:color w:val="1F1F1F"/>
+                <w:sz w:val="18"/>
+                <w:szCs w:val="18"/>
+              </w:rPr>
+              <w:t>SUBJECTS)</w:t>
+            </w:r>
+          </w:p>
+          <w:p>
+            <w:r>
+              <w:rPr>
+                <w:rFonts w:ascii="Consolas" w:eastAsia="Consolas" w:hAnsi="Consolas" w:cs="Consolas"/>
+                <w:color w:val="1F1F1F"/>
+                <w:sz w:val="18"/>
+                <w:szCs w:val="18"/>
+              </w:rPr>
+              <w:t xml:space="preserve">    percentage = (total / </w:t>
+            </w:r>
+            <w:proofErr w:type="spellStart"/>
+            <w:r>
+              <w:rPr>
+                <w:rFonts w:ascii="Consolas" w:eastAsia="Consolas" w:hAnsi="Consolas" w:cs="Consolas"/>
+                <w:color w:val="1F1F1F"/>
+                <w:sz w:val="18"/>
+                <w:szCs w:val="18"/>
+              </w:rPr>
+              <w:t>max_total</w:t>
+            </w:r>
+            <w:proofErr w:type="spellEnd"/>
+            <w:r>
+              <w:rPr>
+                <w:rFonts w:ascii="Consolas" w:eastAsia="Consolas" w:hAnsi="Consolas" w:cs="Consolas"/>
+                <w:color w:val="1F1F1F"/>
+                <w:sz w:val="18"/>
+                <w:szCs w:val="18"/>
+              </w:rPr>
+              <w:t>) * 100</w:t>
+            </w:r>
+          </w:p>
+          <w:p>
+            <w:r>
+              <w:rPr>
+                <w:rFonts w:ascii="Consolas" w:eastAsia="Consolas" w:hAnsi="Consolas" w:cs="Consolas"/>
+                <w:color w:val="1F1F1F"/>
+                <w:sz w:val="18"/>
+                <w:szCs w:val="18"/>
+              </w:rPr>
+              <w:t xml:space="preserve">    grade = </w:t>
+            </w:r>
+            <w:proofErr w:type="spellStart"/>
+            <w:r>
+              <w:rPr>
+                <w:rFonts w:ascii="Consolas" w:eastAsia="Consolas" w:hAnsi="Consolas" w:cs="Consolas"/>
+                <w:color w:val="1F1F1F"/>
+                <w:sz w:val="18"/>
+                <w:szCs w:val="18"/>
+              </w:rPr>
+              <w:t>calculate_grade</w:t>
+            </w:r>
+            <w:proofErr w:type="spellEnd"/>
+            <w:r>
+              <w:rPr>
+                <w:rFonts w:ascii="Consolas" w:eastAsia="Consolas" w:hAnsi="Consolas" w:cs="Consolas"/>
+                <w:color w:val="1F1F1F"/>
+                <w:sz w:val="18"/>
+                <w:szCs w:val="18"/>
+              </w:rPr>
+              <w:t>(percentage)</w:t>
             </w:r>
           </w:p>
           <w:p>
@@ -1524,13 +2008,77 @@
           <w:szCs w:val="22"/>
         </w:rPr>
       </w:pPr>
-      <w:r>
-        <w:rPr>
-          <w:rFonts w:ascii="Calibri" w:eastAsia="Calibri" w:hAnsi="Calibri" w:cs="Calibri"/>
-          <w:sz w:val="22"/>
-          <w:szCs w:val="22"/>
-        </w:rPr>
-        <w:t>calculate_grade() assigns a grade based on the percentage, while get_report() calculates the total, percentage, and final grade. Together, they provide the core logic for generating student reports across the application</w:t>
+      <w:proofErr w:type="spellStart"/>
+      <w:r>
+        <w:rPr>
+          <w:rFonts w:ascii="Calibri" w:eastAsia="Calibri" w:hAnsi="Calibri" w:cs="Calibri"/>
+          <w:sz w:val="22"/>
+          <w:szCs w:val="22"/>
+        </w:rPr>
+        <w:t>calculate_</w:t>
+      </w:r>
+      <w:proofErr w:type="gramStart"/>
+      <w:r>
+        <w:rPr>
+          <w:rFonts w:ascii="Calibri" w:eastAsia="Calibri" w:hAnsi="Calibri" w:cs="Calibri"/>
+          <w:sz w:val="22"/>
+          <w:szCs w:val="22"/>
+        </w:rPr>
+        <w:t>grade</w:t>
+      </w:r>
+      <w:proofErr w:type="spellEnd"/>
+      <w:r>
+        <w:rPr>
+          <w:rFonts w:ascii="Calibri" w:eastAsia="Calibri" w:hAnsi="Calibri" w:cs="Calibri"/>
+          <w:sz w:val="22"/>
+          <w:szCs w:val="22"/>
+        </w:rPr>
+        <w:t>(</w:t>
+      </w:r>
+      <w:proofErr w:type="gramEnd"/>
+      <w:r>
+        <w:rPr>
+          <w:rFonts w:ascii="Calibri" w:eastAsia="Calibri" w:hAnsi="Calibri" w:cs="Calibri"/>
+          <w:sz w:val="22"/>
+          <w:szCs w:val="22"/>
+        </w:rPr>
+        <w:t xml:space="preserve">) assigns a grade based on the percentage, while </w:t>
+      </w:r>
+      <w:proofErr w:type="spellStart"/>
+      <w:r>
+        <w:rPr>
+          <w:rFonts w:ascii="Calibri" w:eastAsia="Calibri" w:hAnsi="Calibri" w:cs="Calibri"/>
+          <w:sz w:val="22"/>
+          <w:szCs w:val="22"/>
+        </w:rPr>
+        <w:t>get_</w:t>
+      </w:r>
+      <w:proofErr w:type="gramStart"/>
+      <w:r>
+        <w:rPr>
+          <w:rFonts w:ascii="Calibri" w:eastAsia="Calibri" w:hAnsi="Calibri" w:cs="Calibri"/>
+          <w:sz w:val="22"/>
+          <w:szCs w:val="22"/>
+        </w:rPr>
+        <w:t>report</w:t>
+      </w:r>
+      <w:proofErr w:type="spellEnd"/>
+      <w:r>
+        <w:rPr>
+          <w:rFonts w:ascii="Calibri" w:eastAsia="Calibri" w:hAnsi="Calibri" w:cs="Calibri"/>
+          <w:sz w:val="22"/>
+          <w:szCs w:val="22"/>
+        </w:rPr>
+        <w:t>(</w:t>
+      </w:r>
+      <w:proofErr w:type="gramEnd"/>
+      <w:r>
+        <w:rPr>
+          <w:rFonts w:ascii="Calibri" w:eastAsia="Calibri" w:hAnsi="Calibri" w:cs="Calibri"/>
+          <w:sz w:val="22"/>
+          <w:szCs w:val="22"/>
+        </w:rPr>
+        <w:t>) calculates the total, percentage, and final grade. Together, they provide the core logic for generating student reports across the application</w:t>
       </w:r>
       <w:r>
         <w:rPr>
@@ -1736,7 +2284,6 @@
           <w:sz w:val="26"/>
           <w:szCs w:val="26"/>
         </w:rPr>
-        <w:lastRenderedPageBreak/>
         <w:t>8. Output Screenshot</w:t>
       </w:r>
     </w:p>
@@ -1895,6 +2442,7 @@
           <w:sz w:val="26"/>
           <w:szCs w:val="26"/>
         </w:rPr>
+        <w:lastRenderedPageBreak/>
         <w:t>9. Project Timeline</w:t>
       </w:r>
     </w:p>
@@ -1914,7 +2462,6 @@
           <w:sz w:val="26"/>
           <w:szCs w:val="26"/>
         </w:rPr>
-        <w:lastRenderedPageBreak/>
         <w:t>9. Tools &amp; Technologies Used</w:t>
       </w:r>
     </w:p>
@@ -2043,6 +2590,7 @@
               </w:rPr>
               <w:t>Python Dictionary (</w:t>
             </w:r>
+            <w:proofErr w:type="spellStart"/>
             <w:r>
               <w:rPr>
                 <w:rStyle w:val="HTMLCode"/>
@@ -2051,6 +2599,7 @@
               </w:rPr>
               <w:t>dict</w:t>
             </w:r>
+            <w:proofErr w:type="spellEnd"/>
             <w:r>
               <w:rPr>
                 <w:rStyle w:val="Strong"/>
@@ -2346,13 +2895,23 @@
         </w:numPr>
         <w:spacing w:after="80"/>
       </w:pPr>
-      <w:r>
-        <w:rPr>
-          <w:rFonts w:ascii="Calibri" w:eastAsia="Calibri" w:hAnsi="Calibri" w:cs="Calibri"/>
-          <w:sz w:val="22"/>
-          <w:szCs w:val="22"/>
-        </w:rPr>
-        <w:t>Brainware University – Python Programming Course Guidelines</w:t>
+      <w:proofErr w:type="spellStart"/>
+      <w:r>
+        <w:rPr>
+          <w:rFonts w:ascii="Calibri" w:eastAsia="Calibri" w:hAnsi="Calibri" w:cs="Calibri"/>
+          <w:sz w:val="22"/>
+          <w:szCs w:val="22"/>
+        </w:rPr>
+        <w:t>Brainware</w:t>
+      </w:r>
+      <w:proofErr w:type="spellEnd"/>
+      <w:r>
+        <w:rPr>
+          <w:rFonts w:ascii="Calibri" w:eastAsia="Calibri" w:hAnsi="Calibri" w:cs="Calibri"/>
+          <w:sz w:val="22"/>
+          <w:szCs w:val="22"/>
+        </w:rPr>
+        <w:t xml:space="preserve"> University – Python Programming Course Guidelines</w:t>
       </w:r>
     </w:p>
     <w:p>
@@ -2563,7 +3122,6 @@
           <w:sz w:val="26"/>
           <w:szCs w:val="26"/>
         </w:rPr>
-        <w:lastRenderedPageBreak/>
         <w:t>1</w:t>
       </w:r>
       <w:r>

</xml_diff>